<commit_message>
added assets + wrote basic main file
</commit_message>
<xml_diff>
--- a/Tower Defence Game/Docs/project brief.docx
+++ b/Tower Defence Game/Docs/project brief.docx
@@ -69,15 +69,7 @@
         </w:numPr>
       </w:pPr>
       <w:r>
-        <w:t xml:space="preserve">Skill </w:t>
-      </w:r>
-      <w:proofErr w:type="gramStart"/>
-      <w:r>
-        <w:t>tree  (</w:t>
-      </w:r>
-      <w:proofErr w:type="gramEnd"/>
-      <w:r>
-        <w:t xml:space="preserve">&amp; points)  </w:t>
+        <w:t xml:space="preserve">Skill tree  (&amp; points)  </w:t>
       </w:r>
     </w:p>
     <w:p>
@@ -121,19 +113,14 @@
     </w:p>
     <w:p>
       <w:r>
-        <w:t xml:space="preserve">Can be reversed horizontally </w:t>
-      </w:r>
-      <w:proofErr w:type="gramStart"/>
-      <w:r>
-        <w:t>depending</w:t>
-      </w:r>
-      <w:proofErr w:type="gramEnd"/>
-      <w:r>
-        <w:t xml:space="preserve"> which side the player is</w:t>
+        <w:t>Can be reversed horizontally depending which side the player is</w:t>
       </w:r>
     </w:p>
     <w:p>
       <w:r>
+        <w:rPr>
+          <w:noProof/>
+        </w:rPr>
         <mc:AlternateContent>
           <mc:Choice Requires="wps">
             <w:drawing>
@@ -200,6 +187,9 @@
         </mc:AlternateContent>
       </w:r>
       <w:r>
+        <w:rPr>
+          <w:noProof/>
+        </w:rPr>
         <mc:AlternateContent>
           <mc:Choice Requires="wps">
             <w:drawing>
@@ -266,6 +256,9 @@
         </mc:AlternateContent>
       </w:r>
       <w:r>
+        <w:rPr>
+          <w:noProof/>
+        </w:rPr>
         <mc:AlternateContent>
           <mc:Choice Requires="wps">
             <w:drawing>
@@ -332,6 +325,9 @@
         </mc:AlternateContent>
       </w:r>
       <w:r>
+        <w:rPr>
+          <w:noProof/>
+        </w:rPr>
         <mc:AlternateContent>
           <mc:Choice Requires="wps">
             <w:drawing>
@@ -398,6 +394,9 @@
         </mc:AlternateContent>
       </w:r>
       <w:r>
+        <w:rPr>
+          <w:noProof/>
+        </w:rPr>
         <mc:AlternateContent>
           <mc:Choice Requires="wpg">
             <w:drawing>
@@ -798,6 +797,9 @@
         </mc:AlternateContent>
       </w:r>
       <w:r>
+        <w:rPr>
+          <w:noProof/>
+        </w:rPr>
         <mc:AlternateContent>
           <mc:Choice Requires="wpg">
             <w:drawing>
@@ -1198,6 +1200,9 @@
         </mc:AlternateContent>
       </w:r>
       <w:r>
+        <w:rPr>
+          <w:noProof/>
+        </w:rPr>
         <mc:AlternateContent>
           <mc:Choice Requires="wpg">
             <w:drawing>
@@ -1598,6 +1603,9 @@
         </mc:AlternateContent>
       </w:r>
       <w:r>
+        <w:rPr>
+          <w:noProof/>
+        </w:rPr>
         <mc:AlternateContent>
           <mc:Choice Requires="wpg">
             <w:drawing>
@@ -1998,6 +2006,9 @@
         </mc:AlternateContent>
       </w:r>
       <w:r>
+        <w:rPr>
+          <w:noProof/>
+        </w:rPr>
         <mc:AlternateContent>
           <mc:Choice Requires="wps">
             <w:drawing>
@@ -2108,6 +2119,9 @@
         </mc:AlternateContent>
       </w:r>
       <w:r>
+        <w:rPr>
+          <w:noProof/>
+        </w:rPr>
         <mc:AlternateContent>
           <mc:Choice Requires="wps">
             <w:drawing>
@@ -2226,7 +2240,16 @@
     <w:p>
       <w:r>
         <w:lastRenderedPageBreak/>
-        <w:t>Packages:</w:t>
+        <w:t>Packages</w:t>
+      </w:r>
+      <w:r>
+        <w:t>/</w:t>
+      </w:r>
+      <w:r>
+        <w:t>Online Assets</w:t>
+      </w:r>
+      <w:r>
+        <w:t>:</w:t>
       </w:r>
     </w:p>
     <w:p>
@@ -2236,7 +2259,16 @@
       </w:r>
       <w:proofErr w:type="spellEnd"/>
     </w:p>
-    <w:p/>
+    <w:p>
+      <w:hyperlink r:id="rId5" w:history="1">
+        <w:r>
+          <w:rPr>
+            <w:rStyle w:val="Hyperlink"/>
+          </w:rPr>
+          <w:t>Tiny Swords by Pixel Frog</w:t>
+        </w:r>
+      </w:hyperlink>
+    </w:p>
     <w:p/>
     <w:p>
       <w:r>
@@ -3318,6 +3350,29 @@
       <w:spacing w:val="5"/>
     </w:rPr>
   </w:style>
+  <w:style w:type="character" w:styleId="Hyperlink">
+    <w:name w:val="Hyperlink"/>
+    <w:basedOn w:val="DefaultParagraphFont"/>
+    <w:uiPriority w:val="99"/>
+    <w:unhideWhenUsed/>
+    <w:rsid w:val="00A17781"/>
+    <w:rPr>
+      <w:color w:val="467886" w:themeColor="hyperlink"/>
+      <w:u w:val="single"/>
+    </w:rPr>
+  </w:style>
+  <w:style w:type="character" w:styleId="UnresolvedMention">
+    <w:name w:val="Unresolved Mention"/>
+    <w:basedOn w:val="DefaultParagraphFont"/>
+    <w:uiPriority w:val="99"/>
+    <w:semiHidden/>
+    <w:unhideWhenUsed/>
+    <w:rsid w:val="00A17781"/>
+    <w:rPr>
+      <w:color w:val="605E5C"/>
+      <w:shd w:val="clear" w:color="auto" w:fill="E1DFDD"/>
+    </w:rPr>
+  </w:style>
 </w:styles>
 </file>
 

</xml_diff>